<commit_message>
feat(template): rebuild 5 DOCX templates from source government forms (从源文件重建DOCX模板)
- activity_plan: simplified 13-row table from source, add date showTime
- security_plan: single-column wide-row table with risk-level conditionals
- risk_assessment: content updated to match code schema fields
- responsibility_letter: hardcoded statutory declarations, right-aligned signature block
- filing_commitment: rebuilt with first-line indent 2chars, right-aligned signature
- fonts: FZXiaoBiaoSong-B05S (title), KaiTi_GB2312 (label), FangSong_GB2312 (body)
- inject activity_name/sponsor/risk_level into docxtpl render context
- add scripts/rebuild_templates.py for one-shot template rebuild
</commit_message>
<xml_diff>
--- a/app/templates/activity_plan/template.docx
+++ b/app/templates/activity_plan/template.docx
@@ -4,92 +4,446 @@
   <w:body>
     <w:p>
       <w:pPr>
-        <w:pStyle w:val="Title"/>
+        <w:jc w:val="center"/>
       </w:pPr>
       <w:r>
+        <w:rPr>
+          <w:rFonts w:ascii="FZXiaoBiaoSong-B05S" w:hAnsi="FZXiaoBiaoSong-B05S" w:eastAsia="FZXiaoBiaoSong-B05S"/>
+          <w:b/>
+          <w:sz w:val="44"/>
+        </w:rPr>
         <w:t>活动方案</w:t>
       </w:r>
     </w:p>
-    <w:p/>
-    <w:p>
-      <w:r>
-        <w:t>活动主要内容：</w:t>
-      </w:r>
-    </w:p>
-    <w:p>
-      <w:r>
-        <w:t>{{ activity_content }}</w:t>
-      </w:r>
-    </w:p>
-    <w:p/>
-    <w:p>
-      <w:r>
-        <w:t>活动开始时间：{{ start_time }}</w:t>
-      </w:r>
-    </w:p>
-    <w:p>
-      <w:r>
-        <w:t>活动结束时间：{{ end_time }}</w:t>
-      </w:r>
-    </w:p>
-    <w:p>
-      <w:r>
-        <w:t>共计天数：{{ total_days }}</w:t>
-      </w:r>
-    </w:p>
-    <w:p>
-      <w:r>
-        <w:t>开幕式时间：{{ opening_start }} 至 {{ opening_end }}</w:t>
-      </w:r>
-    </w:p>
-    <w:p/>
-    <w:p>
-      <w:r>
-        <w:t>工作人员：{{ staff_count }}人</w:t>
-      </w:r>
-    </w:p>
-    <w:p>
-      <w:r>
-        <w:t>演员：{{ performer_count }}人</w:t>
-      </w:r>
-    </w:p>
-    <w:p>
-      <w:r>
-        <w:t>嘉宾：{{ guest_count }}人</w:t>
-      </w:r>
-    </w:p>
-    <w:p>
-      <w:r>
-        <w:t>主要活动日人数：{{ opening_crowd }}人</w:t>
-      </w:r>
-    </w:p>
-    <w:p>
-      <w:r>
-        <w:t>平日人数：{{ regular_crowd }}人</w:t>
-      </w:r>
-    </w:p>
-    <w:p/>
-    <w:p>
-      <w:r>
-        <w:t>搭建方案：</w:t>
-      </w:r>
-    </w:p>
-    <w:p>
-      <w:r>
-        <w:t>{{ construction_plan }}</w:t>
-      </w:r>
-    </w:p>
-    <w:p/>
-    <w:p>
-      <w:r>
-        <w:t>负责人联系方式：{{ contact_phone }}</w:t>
-      </w:r>
-    </w:p>
-    <w:p>
-      <w:r>
-        <w:t>备注：{{ remarks }}</w:t>
-      </w:r>
-    </w:p>
+    <w:tbl>
+      <w:tblPr>
+        <w:tblStyle w:val="TableGrid"/>
+        <w:tblW w:type="auto" w:w="0"/>
+        <w:tblLook w:firstColumn="1" w:firstRow="1" w:lastColumn="0" w:lastRow="0" w:noHBand="0" w:noVBand="1" w:val="04A0"/>
+      </w:tblPr>
+      <w:tblGrid>
+        <w:gridCol w:w="4320"/>
+        <w:gridCol w:w="4320"/>
+      </w:tblGrid>
+      <w:tr>
+        <w:tc>
+          <w:tcPr>
+            <w:tcW w:type="dxa" w:w="4320"/>
+          </w:tcPr>
+          <w:p>
+            <w:r>
+              <w:rPr>
+                <w:rFonts w:ascii="KaiTi_GB2312" w:hAnsi="KaiTi_GB2312" w:eastAsia="KaiTi_GB2312"/>
+                <w:b/>
+                <w:sz w:val="21"/>
+              </w:rPr>
+              <w:t>活动名称</w:t>
+            </w:r>
+          </w:p>
+        </w:tc>
+        <w:tc>
+          <w:tcPr>
+            <w:tcW w:type="dxa" w:w="4320"/>
+          </w:tcPr>
+          <w:p>
+            <w:r>
+              <w:rPr>
+                <w:rFonts w:ascii="FangSong_GB2312" w:hAnsi="FangSong_GB2312" w:eastAsia="FangSong_GB2312"/>
+                <w:b w:val="0"/>
+                <w:sz w:val="21"/>
+              </w:rPr>
+              <w:t>{{ activity_name }}</w:t>
+            </w:r>
+          </w:p>
+        </w:tc>
+      </w:tr>
+      <w:tr>
+        <w:tc>
+          <w:tcPr>
+            <w:tcW w:type="dxa" w:w="4320"/>
+          </w:tcPr>
+          <w:p>
+            <w:r>
+              <w:rPr>
+                <w:rFonts w:ascii="KaiTi_GB2312" w:hAnsi="KaiTi_GB2312" w:eastAsia="KaiTi_GB2312"/>
+                <w:b/>
+                <w:sz w:val="21"/>
+              </w:rPr>
+              <w:t>主办单位</w:t>
+            </w:r>
+          </w:p>
+        </w:tc>
+        <w:tc>
+          <w:tcPr>
+            <w:tcW w:type="dxa" w:w="4320"/>
+          </w:tcPr>
+          <w:p>
+            <w:r>
+              <w:rPr>
+                <w:rFonts w:ascii="FangSong_GB2312" w:hAnsi="FangSong_GB2312" w:eastAsia="FangSong_GB2312"/>
+                <w:b w:val="0"/>
+                <w:sz w:val="21"/>
+              </w:rPr>
+              <w:t>{{ sponsor }}</w:t>
+            </w:r>
+          </w:p>
+        </w:tc>
+      </w:tr>
+      <w:tr>
+        <w:tc>
+          <w:tcPr>
+            <w:tcW w:type="dxa" w:w="4320"/>
+          </w:tcPr>
+          <w:p>
+            <w:r>
+              <w:rPr>
+                <w:rFonts w:ascii="KaiTi_GB2312" w:hAnsi="KaiTi_GB2312" w:eastAsia="KaiTi_GB2312"/>
+                <w:b/>
+                <w:sz w:val="21"/>
+              </w:rPr>
+              <w:t>活动负责人及联系方式（手机）</w:t>
+            </w:r>
+          </w:p>
+        </w:tc>
+        <w:tc>
+          <w:tcPr>
+            <w:tcW w:type="dxa" w:w="4320"/>
+          </w:tcPr>
+          <w:p>
+            <w:r>
+              <w:rPr>
+                <w:rFonts w:ascii="FangSong_GB2312" w:hAnsi="FangSong_GB2312" w:eastAsia="FangSong_GB2312"/>
+                <w:b w:val="0"/>
+                <w:sz w:val="21"/>
+              </w:rPr>
+              <w:t>{{ contact_phone }}</w:t>
+            </w:r>
+          </w:p>
+        </w:tc>
+      </w:tr>
+      <w:tr>
+        <w:tc>
+          <w:tcPr>
+            <w:tcW w:type="dxa" w:w="4320"/>
+          </w:tcPr>
+          <w:p>
+            <w:r>
+              <w:rPr>
+                <w:rFonts w:ascii="KaiTi_GB2312" w:hAnsi="KaiTi_GB2312" w:eastAsia="KaiTi_GB2312"/>
+                <w:b/>
+                <w:sz w:val="21"/>
+              </w:rPr>
+              <w:t>活动时间</w:t>
+            </w:r>
+          </w:p>
+        </w:tc>
+        <w:tc>
+          <w:tcPr>
+            <w:tcW w:type="dxa" w:w="4320"/>
+          </w:tcPr>
+          <w:p>
+            <w:r>
+              <w:rPr>
+                <w:rFonts w:ascii="FangSong_GB2312" w:hAnsi="FangSong_GB2312" w:eastAsia="FangSong_GB2312"/>
+                <w:b w:val="0"/>
+                <w:sz w:val="21"/>
+              </w:rPr>
+              <w:t>{{ start_time }} 至 {{ end_time }}，共计 {{ total_days }} 天</w:t>
+            </w:r>
+          </w:p>
+        </w:tc>
+      </w:tr>
+      <w:tr>
+        <w:tc>
+          <w:tcPr>
+            <w:tcW w:type="dxa" w:w="4320"/>
+          </w:tcPr>
+          <w:p>
+            <w:r>
+              <w:rPr>
+                <w:rFonts w:ascii="KaiTi_GB2312" w:hAnsi="KaiTi_GB2312" w:eastAsia="KaiTi_GB2312"/>
+                <w:b/>
+                <w:sz w:val="21"/>
+              </w:rPr>
+              <w:t>开幕式时间</w:t>
+            </w:r>
+          </w:p>
+        </w:tc>
+        <w:tc>
+          <w:tcPr>
+            <w:tcW w:type="dxa" w:w="4320"/>
+          </w:tcPr>
+          <w:p>
+            <w:r>
+              <w:rPr>
+                <w:rFonts w:ascii="FangSong_GB2312" w:hAnsi="FangSong_GB2312" w:eastAsia="FangSong_GB2312"/>
+                <w:b w:val="0"/>
+                <w:sz w:val="21"/>
+              </w:rPr>
+              <w:t>{% if has_opening == '是' %}{{ opening_start }} 至 {{ opening_end }}{% else %}无{% endif %}</w:t>
+            </w:r>
+          </w:p>
+        </w:tc>
+      </w:tr>
+      <w:tr>
+        <w:tc>
+          <w:tcPr>
+            <w:tcW w:type="dxa" w:w="4320"/>
+          </w:tcPr>
+          <w:p>
+            <w:r>
+              <w:rPr>
+                <w:rFonts w:ascii="KaiTi_GB2312" w:hAnsi="KaiTi_GB2312" w:eastAsia="KaiTi_GB2312"/>
+                <w:b/>
+                <w:sz w:val="21"/>
+              </w:rPr>
+              <w:t>主要活动内容</w:t>
+            </w:r>
+          </w:p>
+        </w:tc>
+        <w:tc>
+          <w:tcPr>
+            <w:tcW w:type="dxa" w:w="4320"/>
+          </w:tcPr>
+          <w:p>
+            <w:r>
+              <w:rPr>
+                <w:rFonts w:ascii="FangSong_GB2312" w:hAnsi="FangSong_GB2312" w:eastAsia="FangSong_GB2312"/>
+                <w:b w:val="0"/>
+                <w:sz w:val="21"/>
+              </w:rPr>
+              <w:t>{{ activity_content }}</w:t>
+            </w:r>
+          </w:p>
+        </w:tc>
+      </w:tr>
+      <w:tr>
+        <w:tc>
+          <w:tcPr>
+            <w:tcW w:type="dxa" w:w="4320"/>
+          </w:tcPr>
+          <w:p>
+            <w:r>
+              <w:rPr>
+                <w:rFonts w:ascii="KaiTi_GB2312" w:hAnsi="KaiTi_GB2312" w:eastAsia="KaiTi_GB2312"/>
+                <w:b/>
+                <w:sz w:val="21"/>
+              </w:rPr>
+              <w:t>工作人员数量</w:t>
+            </w:r>
+          </w:p>
+        </w:tc>
+        <w:tc>
+          <w:tcPr>
+            <w:tcW w:type="dxa" w:w="4320"/>
+          </w:tcPr>
+          <w:p>
+            <w:r>
+              <w:rPr>
+                <w:rFonts w:ascii="FangSong_GB2312" w:hAnsi="FangSong_GB2312" w:eastAsia="FangSong_GB2312"/>
+                <w:b w:val="0"/>
+                <w:sz w:val="21"/>
+              </w:rPr>
+              <w:t>{{ staff_count }}</w:t>
+            </w:r>
+          </w:p>
+        </w:tc>
+      </w:tr>
+      <w:tr>
+        <w:tc>
+          <w:tcPr>
+            <w:tcW w:type="dxa" w:w="4320"/>
+          </w:tcPr>
+          <w:p>
+            <w:r>
+              <w:rPr>
+                <w:rFonts w:ascii="KaiTi_GB2312" w:hAnsi="KaiTi_GB2312" w:eastAsia="KaiTi_GB2312"/>
+                <w:b/>
+                <w:sz w:val="21"/>
+              </w:rPr>
+              <w:t>演员数量</w:t>
+            </w:r>
+          </w:p>
+        </w:tc>
+        <w:tc>
+          <w:tcPr>
+            <w:tcW w:type="dxa" w:w="4320"/>
+          </w:tcPr>
+          <w:p>
+            <w:r>
+              <w:rPr>
+                <w:rFonts w:ascii="FangSong_GB2312" w:hAnsi="FangSong_GB2312" w:eastAsia="FangSong_GB2312"/>
+                <w:b w:val="0"/>
+                <w:sz w:val="21"/>
+              </w:rPr>
+              <w:t>{{ performer_count }}</w:t>
+            </w:r>
+          </w:p>
+        </w:tc>
+      </w:tr>
+      <w:tr>
+        <w:tc>
+          <w:tcPr>
+            <w:tcW w:type="dxa" w:w="4320"/>
+          </w:tcPr>
+          <w:p>
+            <w:r>
+              <w:rPr>
+                <w:rFonts w:ascii="KaiTi_GB2312" w:hAnsi="KaiTi_GB2312" w:eastAsia="KaiTi_GB2312"/>
+                <w:b/>
+                <w:sz w:val="21"/>
+              </w:rPr>
+              <w:t>嘉宾数量</w:t>
+            </w:r>
+          </w:p>
+        </w:tc>
+        <w:tc>
+          <w:tcPr>
+            <w:tcW w:type="dxa" w:w="4320"/>
+          </w:tcPr>
+          <w:p>
+            <w:r>
+              <w:rPr>
+                <w:rFonts w:ascii="FangSong_GB2312" w:hAnsi="FangSong_GB2312" w:eastAsia="FangSong_GB2312"/>
+                <w:b w:val="0"/>
+                <w:sz w:val="21"/>
+              </w:rPr>
+              <w:t>{{ guest_count }}</w:t>
+            </w:r>
+          </w:p>
+        </w:tc>
+      </w:tr>
+      <w:tr>
+        <w:tc>
+          <w:tcPr>
+            <w:tcW w:type="dxa" w:w="4320"/>
+          </w:tcPr>
+          <w:p>
+            <w:r>
+              <w:rPr>
+                <w:rFonts w:ascii="KaiTi_GB2312" w:hAnsi="KaiTi_GB2312" w:eastAsia="KaiTi_GB2312"/>
+                <w:b/>
+                <w:sz w:val="21"/>
+              </w:rPr>
+              <w:t>主要活动日人数规模</w:t>
+            </w:r>
+          </w:p>
+        </w:tc>
+        <w:tc>
+          <w:tcPr>
+            <w:tcW w:type="dxa" w:w="4320"/>
+          </w:tcPr>
+          <w:p>
+            <w:r>
+              <w:rPr>
+                <w:rFonts w:ascii="FangSong_GB2312" w:hAnsi="FangSong_GB2312" w:eastAsia="FangSong_GB2312"/>
+                <w:b w:val="0"/>
+                <w:sz w:val="21"/>
+              </w:rPr>
+              <w:t>{{ opening_crowd }}</w:t>
+            </w:r>
+          </w:p>
+        </w:tc>
+      </w:tr>
+      <w:tr>
+        <w:tc>
+          <w:tcPr>
+            <w:tcW w:type="dxa" w:w="4320"/>
+          </w:tcPr>
+          <w:p>
+            <w:r>
+              <w:rPr>
+                <w:rFonts w:ascii="KaiTi_GB2312" w:hAnsi="KaiTi_GB2312" w:eastAsia="KaiTi_GB2312"/>
+                <w:b/>
+                <w:sz w:val="21"/>
+              </w:rPr>
+              <w:t>平日人数规模</w:t>
+            </w:r>
+          </w:p>
+        </w:tc>
+        <w:tc>
+          <w:tcPr>
+            <w:tcW w:type="dxa" w:w="4320"/>
+          </w:tcPr>
+          <w:p>
+            <w:r>
+              <w:rPr>
+                <w:rFonts w:ascii="FangSong_GB2312" w:hAnsi="FangSong_GB2312" w:eastAsia="FangSong_GB2312"/>
+                <w:b w:val="0"/>
+                <w:sz w:val="21"/>
+              </w:rPr>
+              <w:t>{{ regular_crowd }}</w:t>
+            </w:r>
+          </w:p>
+        </w:tc>
+      </w:tr>
+      <w:tr>
+        <w:tc>
+          <w:tcPr>
+            <w:tcW w:type="dxa" w:w="4320"/>
+          </w:tcPr>
+          <w:p>
+            <w:r>
+              <w:rPr>
+                <w:rFonts w:ascii="KaiTi_GB2312" w:hAnsi="KaiTi_GB2312" w:eastAsia="KaiTi_GB2312"/>
+                <w:b/>
+                <w:sz w:val="21"/>
+              </w:rPr>
+              <w:t>搭建方案（含材料明细、平面图、效果图、标注尺寸）</w:t>
+            </w:r>
+          </w:p>
+        </w:tc>
+        <w:tc>
+          <w:tcPr>
+            <w:tcW w:type="dxa" w:w="4320"/>
+          </w:tcPr>
+          <w:p>
+            <w:r>
+              <w:rPr>
+                <w:rFonts w:ascii="FangSong_GB2312" w:hAnsi="FangSong_GB2312" w:eastAsia="FangSong_GB2312"/>
+                <w:b w:val="0"/>
+                <w:sz w:val="21"/>
+              </w:rPr>
+              <w:t>{{ construction_plan }}</w:t>
+            </w:r>
+          </w:p>
+        </w:tc>
+      </w:tr>
+      <w:tr>
+        <w:tc>
+          <w:tcPr>
+            <w:tcW w:type="dxa" w:w="4320"/>
+          </w:tcPr>
+          <w:p>
+            <w:r>
+              <w:rPr>
+                <w:rFonts w:ascii="KaiTi_GB2312" w:hAnsi="KaiTi_GB2312" w:eastAsia="KaiTi_GB2312"/>
+                <w:b/>
+                <w:sz w:val="21"/>
+              </w:rPr>
+              <w:t>备注</w:t>
+            </w:r>
+          </w:p>
+        </w:tc>
+        <w:tc>
+          <w:tcPr>
+            <w:tcW w:type="dxa" w:w="4320"/>
+          </w:tcPr>
+          <w:p>
+            <w:r>
+              <w:rPr>
+                <w:rFonts w:ascii="FangSong_GB2312" w:hAnsi="FangSong_GB2312" w:eastAsia="FangSong_GB2312"/>
+                <w:b w:val="0"/>
+                <w:sz w:val="21"/>
+              </w:rPr>
+              <w:t>备注：现场秩序维护及安全保障由主办方负责。</w:t>
+              <w:br/>
+              <w:t>{{ remarks }}</w:t>
+            </w:r>
+          </w:p>
+        </w:tc>
+      </w:tr>
+    </w:tbl>
     <w:sectPr>
       <w:pgSz w:w="12240" w:h="15840"/>
       <w:pgMar w:top="1440" w:right="1800" w:bottom="1440" w:left="1800" w:header="720" w:footer="720" w:gutter="0"/>
@@ -463,6 +817,10 @@
     <w:name w:val="Normal"/>
     <w:qFormat/>
     <w:rsid w:val="00FC693F"/>
+    <w:rPr>
+      <w:rFonts w:ascii="FangSong_GB2312" w:hAnsi="FangSong_GB2312"/>
+      <w:sz w:val="21"/>
+    </w:rPr>
   </w:style>
   <w:style w:type="paragraph" w:styleId="Header">
     <w:name w:val="header"/>

</xml_diff>

<commit_message>
feat(template): rebuild DOCX templates from source forms + filing workflow (从源文件重建模板+备案工作流)
* Rebuild all 5 DOCX templates from source government forms
* Two-step Manager signing with deferred DOCX generation
* Supplement loop: edit → re-sign → re-pack → re-handover
* GovLiaison batch audit + approval panel
* UC6 removed: approval auto-transitions to 审批通过-待举办
* Async PDF generation via LibreOffice (Semaphore(1))
* ZIP download visible in all post-pack statuses
* Fonts: 方正小标宋简体 / 楷体_GB2312 / 仿宋_GB2312
* Bump version to v0.30.0
</commit_message>
<xml_diff>
--- a/app/templates/activity_plan/template.docx
+++ b/app/templates/activity_plan/template.docx
@@ -4,92 +4,446 @@
   <w:body>
     <w:p>
       <w:pPr>
-        <w:pStyle w:val="Title"/>
+        <w:jc w:val="center"/>
       </w:pPr>
       <w:r>
+        <w:rPr>
+          <w:rFonts w:ascii="FZXiaoBiaoSong-B05S" w:hAnsi="FZXiaoBiaoSong-B05S" w:eastAsia="FZXiaoBiaoSong-B05S"/>
+          <w:b/>
+          <w:sz w:val="44"/>
+        </w:rPr>
         <w:t>活动方案</w:t>
       </w:r>
     </w:p>
-    <w:p/>
-    <w:p>
-      <w:r>
-        <w:t>活动主要内容：</w:t>
-      </w:r>
-    </w:p>
-    <w:p>
-      <w:r>
-        <w:t>{{ activity_content }}</w:t>
-      </w:r>
-    </w:p>
-    <w:p/>
-    <w:p>
-      <w:r>
-        <w:t>活动开始时间：{{ start_time }}</w:t>
-      </w:r>
-    </w:p>
-    <w:p>
-      <w:r>
-        <w:t>活动结束时间：{{ end_time }}</w:t>
-      </w:r>
-    </w:p>
-    <w:p>
-      <w:r>
-        <w:t>共计天数：{{ total_days }}</w:t>
-      </w:r>
-    </w:p>
-    <w:p>
-      <w:r>
-        <w:t>开幕式时间：{{ opening_start }} 至 {{ opening_end }}</w:t>
-      </w:r>
-    </w:p>
-    <w:p/>
-    <w:p>
-      <w:r>
-        <w:t>工作人员：{{ staff_count }}人</w:t>
-      </w:r>
-    </w:p>
-    <w:p>
-      <w:r>
-        <w:t>演员：{{ performer_count }}人</w:t>
-      </w:r>
-    </w:p>
-    <w:p>
-      <w:r>
-        <w:t>嘉宾：{{ guest_count }}人</w:t>
-      </w:r>
-    </w:p>
-    <w:p>
-      <w:r>
-        <w:t>主要活动日人数：{{ opening_crowd }}人</w:t>
-      </w:r>
-    </w:p>
-    <w:p>
-      <w:r>
-        <w:t>平日人数：{{ regular_crowd }}人</w:t>
-      </w:r>
-    </w:p>
-    <w:p/>
-    <w:p>
-      <w:r>
-        <w:t>搭建方案：</w:t>
-      </w:r>
-    </w:p>
-    <w:p>
-      <w:r>
-        <w:t>{{ construction_plan }}</w:t>
-      </w:r>
-    </w:p>
-    <w:p/>
-    <w:p>
-      <w:r>
-        <w:t>负责人联系方式：{{ contact_phone }}</w:t>
-      </w:r>
-    </w:p>
-    <w:p>
-      <w:r>
-        <w:t>备注：{{ remarks }}</w:t>
-      </w:r>
-    </w:p>
+    <w:tbl>
+      <w:tblPr>
+        <w:tblStyle w:val="TableGrid"/>
+        <w:tblW w:type="auto" w:w="0"/>
+        <w:tblLook w:firstColumn="1" w:firstRow="1" w:lastColumn="0" w:lastRow="0" w:noHBand="0" w:noVBand="1" w:val="04A0"/>
+      </w:tblPr>
+      <w:tblGrid>
+        <w:gridCol w:w="4320"/>
+        <w:gridCol w:w="4320"/>
+      </w:tblGrid>
+      <w:tr>
+        <w:tc>
+          <w:tcPr>
+            <w:tcW w:type="dxa" w:w="4320"/>
+          </w:tcPr>
+          <w:p>
+            <w:r>
+              <w:rPr>
+                <w:rFonts w:ascii="KaiTi_GB2312" w:hAnsi="KaiTi_GB2312" w:eastAsia="KaiTi_GB2312"/>
+                <w:b/>
+                <w:sz w:val="21"/>
+              </w:rPr>
+              <w:t>活动名称</w:t>
+            </w:r>
+          </w:p>
+        </w:tc>
+        <w:tc>
+          <w:tcPr>
+            <w:tcW w:type="dxa" w:w="4320"/>
+          </w:tcPr>
+          <w:p>
+            <w:r>
+              <w:rPr>
+                <w:rFonts w:ascii="FangSong_GB2312" w:hAnsi="FangSong_GB2312" w:eastAsia="FangSong_GB2312"/>
+                <w:b w:val="0"/>
+                <w:sz w:val="21"/>
+              </w:rPr>
+              <w:t>{{ activity_name }}</w:t>
+            </w:r>
+          </w:p>
+        </w:tc>
+      </w:tr>
+      <w:tr>
+        <w:tc>
+          <w:tcPr>
+            <w:tcW w:type="dxa" w:w="4320"/>
+          </w:tcPr>
+          <w:p>
+            <w:r>
+              <w:rPr>
+                <w:rFonts w:ascii="KaiTi_GB2312" w:hAnsi="KaiTi_GB2312" w:eastAsia="KaiTi_GB2312"/>
+                <w:b/>
+                <w:sz w:val="21"/>
+              </w:rPr>
+              <w:t>主办单位</w:t>
+            </w:r>
+          </w:p>
+        </w:tc>
+        <w:tc>
+          <w:tcPr>
+            <w:tcW w:type="dxa" w:w="4320"/>
+          </w:tcPr>
+          <w:p>
+            <w:r>
+              <w:rPr>
+                <w:rFonts w:ascii="FangSong_GB2312" w:hAnsi="FangSong_GB2312" w:eastAsia="FangSong_GB2312"/>
+                <w:b w:val="0"/>
+                <w:sz w:val="21"/>
+              </w:rPr>
+              <w:t>{{ sponsor }}</w:t>
+            </w:r>
+          </w:p>
+        </w:tc>
+      </w:tr>
+      <w:tr>
+        <w:tc>
+          <w:tcPr>
+            <w:tcW w:type="dxa" w:w="4320"/>
+          </w:tcPr>
+          <w:p>
+            <w:r>
+              <w:rPr>
+                <w:rFonts w:ascii="KaiTi_GB2312" w:hAnsi="KaiTi_GB2312" w:eastAsia="KaiTi_GB2312"/>
+                <w:b/>
+                <w:sz w:val="21"/>
+              </w:rPr>
+              <w:t>活动负责人及联系方式（手机）</w:t>
+            </w:r>
+          </w:p>
+        </w:tc>
+        <w:tc>
+          <w:tcPr>
+            <w:tcW w:type="dxa" w:w="4320"/>
+          </w:tcPr>
+          <w:p>
+            <w:r>
+              <w:rPr>
+                <w:rFonts w:ascii="FangSong_GB2312" w:hAnsi="FangSong_GB2312" w:eastAsia="FangSong_GB2312"/>
+                <w:b w:val="0"/>
+                <w:sz w:val="21"/>
+              </w:rPr>
+              <w:t>{{ contact_phone }}</w:t>
+            </w:r>
+          </w:p>
+        </w:tc>
+      </w:tr>
+      <w:tr>
+        <w:tc>
+          <w:tcPr>
+            <w:tcW w:type="dxa" w:w="4320"/>
+          </w:tcPr>
+          <w:p>
+            <w:r>
+              <w:rPr>
+                <w:rFonts w:ascii="KaiTi_GB2312" w:hAnsi="KaiTi_GB2312" w:eastAsia="KaiTi_GB2312"/>
+                <w:b/>
+                <w:sz w:val="21"/>
+              </w:rPr>
+              <w:t>活动时间</w:t>
+            </w:r>
+          </w:p>
+        </w:tc>
+        <w:tc>
+          <w:tcPr>
+            <w:tcW w:type="dxa" w:w="4320"/>
+          </w:tcPr>
+          <w:p>
+            <w:r>
+              <w:rPr>
+                <w:rFonts w:ascii="FangSong_GB2312" w:hAnsi="FangSong_GB2312" w:eastAsia="FangSong_GB2312"/>
+                <w:b w:val="0"/>
+                <w:sz w:val="21"/>
+              </w:rPr>
+              <w:t>{{ start_time }} 至 {{ end_time }}，共计 {{ total_days }} 天</w:t>
+            </w:r>
+          </w:p>
+        </w:tc>
+      </w:tr>
+      <w:tr>
+        <w:tc>
+          <w:tcPr>
+            <w:tcW w:type="dxa" w:w="4320"/>
+          </w:tcPr>
+          <w:p>
+            <w:r>
+              <w:rPr>
+                <w:rFonts w:ascii="KaiTi_GB2312" w:hAnsi="KaiTi_GB2312" w:eastAsia="KaiTi_GB2312"/>
+                <w:b/>
+                <w:sz w:val="21"/>
+              </w:rPr>
+              <w:t>开幕式时间</w:t>
+            </w:r>
+          </w:p>
+        </w:tc>
+        <w:tc>
+          <w:tcPr>
+            <w:tcW w:type="dxa" w:w="4320"/>
+          </w:tcPr>
+          <w:p>
+            <w:r>
+              <w:rPr>
+                <w:rFonts w:ascii="FangSong_GB2312" w:hAnsi="FangSong_GB2312" w:eastAsia="FangSong_GB2312"/>
+                <w:b w:val="0"/>
+                <w:sz w:val="21"/>
+              </w:rPr>
+              <w:t>{% if has_opening == '是' %}{{ opening_start }} 至 {{ opening_end }}{% else %}无{% endif %}</w:t>
+            </w:r>
+          </w:p>
+        </w:tc>
+      </w:tr>
+      <w:tr>
+        <w:tc>
+          <w:tcPr>
+            <w:tcW w:type="dxa" w:w="4320"/>
+          </w:tcPr>
+          <w:p>
+            <w:r>
+              <w:rPr>
+                <w:rFonts w:ascii="KaiTi_GB2312" w:hAnsi="KaiTi_GB2312" w:eastAsia="KaiTi_GB2312"/>
+                <w:b/>
+                <w:sz w:val="21"/>
+              </w:rPr>
+              <w:t>主要活动内容</w:t>
+            </w:r>
+          </w:p>
+        </w:tc>
+        <w:tc>
+          <w:tcPr>
+            <w:tcW w:type="dxa" w:w="4320"/>
+          </w:tcPr>
+          <w:p>
+            <w:r>
+              <w:rPr>
+                <w:rFonts w:ascii="FangSong_GB2312" w:hAnsi="FangSong_GB2312" w:eastAsia="FangSong_GB2312"/>
+                <w:b w:val="0"/>
+                <w:sz w:val="21"/>
+              </w:rPr>
+              <w:t>{{ activity_content }}</w:t>
+            </w:r>
+          </w:p>
+        </w:tc>
+      </w:tr>
+      <w:tr>
+        <w:tc>
+          <w:tcPr>
+            <w:tcW w:type="dxa" w:w="4320"/>
+          </w:tcPr>
+          <w:p>
+            <w:r>
+              <w:rPr>
+                <w:rFonts w:ascii="KaiTi_GB2312" w:hAnsi="KaiTi_GB2312" w:eastAsia="KaiTi_GB2312"/>
+                <w:b/>
+                <w:sz w:val="21"/>
+              </w:rPr>
+              <w:t>工作人员数量</w:t>
+            </w:r>
+          </w:p>
+        </w:tc>
+        <w:tc>
+          <w:tcPr>
+            <w:tcW w:type="dxa" w:w="4320"/>
+          </w:tcPr>
+          <w:p>
+            <w:r>
+              <w:rPr>
+                <w:rFonts w:ascii="FangSong_GB2312" w:hAnsi="FangSong_GB2312" w:eastAsia="FangSong_GB2312"/>
+                <w:b w:val="0"/>
+                <w:sz w:val="21"/>
+              </w:rPr>
+              <w:t>{{ staff_count }}</w:t>
+            </w:r>
+          </w:p>
+        </w:tc>
+      </w:tr>
+      <w:tr>
+        <w:tc>
+          <w:tcPr>
+            <w:tcW w:type="dxa" w:w="4320"/>
+          </w:tcPr>
+          <w:p>
+            <w:r>
+              <w:rPr>
+                <w:rFonts w:ascii="KaiTi_GB2312" w:hAnsi="KaiTi_GB2312" w:eastAsia="KaiTi_GB2312"/>
+                <w:b/>
+                <w:sz w:val="21"/>
+              </w:rPr>
+              <w:t>演员数量</w:t>
+            </w:r>
+          </w:p>
+        </w:tc>
+        <w:tc>
+          <w:tcPr>
+            <w:tcW w:type="dxa" w:w="4320"/>
+          </w:tcPr>
+          <w:p>
+            <w:r>
+              <w:rPr>
+                <w:rFonts w:ascii="FangSong_GB2312" w:hAnsi="FangSong_GB2312" w:eastAsia="FangSong_GB2312"/>
+                <w:b w:val="0"/>
+                <w:sz w:val="21"/>
+              </w:rPr>
+              <w:t>{{ performer_count }}</w:t>
+            </w:r>
+          </w:p>
+        </w:tc>
+      </w:tr>
+      <w:tr>
+        <w:tc>
+          <w:tcPr>
+            <w:tcW w:type="dxa" w:w="4320"/>
+          </w:tcPr>
+          <w:p>
+            <w:r>
+              <w:rPr>
+                <w:rFonts w:ascii="KaiTi_GB2312" w:hAnsi="KaiTi_GB2312" w:eastAsia="KaiTi_GB2312"/>
+                <w:b/>
+                <w:sz w:val="21"/>
+              </w:rPr>
+              <w:t>嘉宾数量</w:t>
+            </w:r>
+          </w:p>
+        </w:tc>
+        <w:tc>
+          <w:tcPr>
+            <w:tcW w:type="dxa" w:w="4320"/>
+          </w:tcPr>
+          <w:p>
+            <w:r>
+              <w:rPr>
+                <w:rFonts w:ascii="FangSong_GB2312" w:hAnsi="FangSong_GB2312" w:eastAsia="FangSong_GB2312"/>
+                <w:b w:val="0"/>
+                <w:sz w:val="21"/>
+              </w:rPr>
+              <w:t>{{ guest_count }}</w:t>
+            </w:r>
+          </w:p>
+        </w:tc>
+      </w:tr>
+      <w:tr>
+        <w:tc>
+          <w:tcPr>
+            <w:tcW w:type="dxa" w:w="4320"/>
+          </w:tcPr>
+          <w:p>
+            <w:r>
+              <w:rPr>
+                <w:rFonts w:ascii="KaiTi_GB2312" w:hAnsi="KaiTi_GB2312" w:eastAsia="KaiTi_GB2312"/>
+                <w:b/>
+                <w:sz w:val="21"/>
+              </w:rPr>
+              <w:t>主要活动日人数规模</w:t>
+            </w:r>
+          </w:p>
+        </w:tc>
+        <w:tc>
+          <w:tcPr>
+            <w:tcW w:type="dxa" w:w="4320"/>
+          </w:tcPr>
+          <w:p>
+            <w:r>
+              <w:rPr>
+                <w:rFonts w:ascii="FangSong_GB2312" w:hAnsi="FangSong_GB2312" w:eastAsia="FangSong_GB2312"/>
+                <w:b w:val="0"/>
+                <w:sz w:val="21"/>
+              </w:rPr>
+              <w:t>{{ opening_crowd }}</w:t>
+            </w:r>
+          </w:p>
+        </w:tc>
+      </w:tr>
+      <w:tr>
+        <w:tc>
+          <w:tcPr>
+            <w:tcW w:type="dxa" w:w="4320"/>
+          </w:tcPr>
+          <w:p>
+            <w:r>
+              <w:rPr>
+                <w:rFonts w:ascii="KaiTi_GB2312" w:hAnsi="KaiTi_GB2312" w:eastAsia="KaiTi_GB2312"/>
+                <w:b/>
+                <w:sz w:val="21"/>
+              </w:rPr>
+              <w:t>平日人数规模</w:t>
+            </w:r>
+          </w:p>
+        </w:tc>
+        <w:tc>
+          <w:tcPr>
+            <w:tcW w:type="dxa" w:w="4320"/>
+          </w:tcPr>
+          <w:p>
+            <w:r>
+              <w:rPr>
+                <w:rFonts w:ascii="FangSong_GB2312" w:hAnsi="FangSong_GB2312" w:eastAsia="FangSong_GB2312"/>
+                <w:b w:val="0"/>
+                <w:sz w:val="21"/>
+              </w:rPr>
+              <w:t>{{ regular_crowd }}</w:t>
+            </w:r>
+          </w:p>
+        </w:tc>
+      </w:tr>
+      <w:tr>
+        <w:tc>
+          <w:tcPr>
+            <w:tcW w:type="dxa" w:w="4320"/>
+          </w:tcPr>
+          <w:p>
+            <w:r>
+              <w:rPr>
+                <w:rFonts w:ascii="KaiTi_GB2312" w:hAnsi="KaiTi_GB2312" w:eastAsia="KaiTi_GB2312"/>
+                <w:b/>
+                <w:sz w:val="21"/>
+              </w:rPr>
+              <w:t>搭建方案（含材料明细、平面图、效果图、标注尺寸）</w:t>
+            </w:r>
+          </w:p>
+        </w:tc>
+        <w:tc>
+          <w:tcPr>
+            <w:tcW w:type="dxa" w:w="4320"/>
+          </w:tcPr>
+          <w:p>
+            <w:r>
+              <w:rPr>
+                <w:rFonts w:ascii="FangSong_GB2312" w:hAnsi="FangSong_GB2312" w:eastAsia="FangSong_GB2312"/>
+                <w:b w:val="0"/>
+                <w:sz w:val="21"/>
+              </w:rPr>
+              <w:t>{{ construction_plan }}</w:t>
+            </w:r>
+          </w:p>
+        </w:tc>
+      </w:tr>
+      <w:tr>
+        <w:tc>
+          <w:tcPr>
+            <w:tcW w:type="dxa" w:w="4320"/>
+          </w:tcPr>
+          <w:p>
+            <w:r>
+              <w:rPr>
+                <w:rFonts w:ascii="KaiTi_GB2312" w:hAnsi="KaiTi_GB2312" w:eastAsia="KaiTi_GB2312"/>
+                <w:b/>
+                <w:sz w:val="21"/>
+              </w:rPr>
+              <w:t>备注</w:t>
+            </w:r>
+          </w:p>
+        </w:tc>
+        <w:tc>
+          <w:tcPr>
+            <w:tcW w:type="dxa" w:w="4320"/>
+          </w:tcPr>
+          <w:p>
+            <w:r>
+              <w:rPr>
+                <w:rFonts w:ascii="FangSong_GB2312" w:hAnsi="FangSong_GB2312" w:eastAsia="FangSong_GB2312"/>
+                <w:b w:val="0"/>
+                <w:sz w:val="21"/>
+              </w:rPr>
+              <w:t>备注：现场秩序维护及安全保障由主办方负责。</w:t>
+              <w:br/>
+              <w:t>{{ remarks }}</w:t>
+            </w:r>
+          </w:p>
+        </w:tc>
+      </w:tr>
+    </w:tbl>
     <w:sectPr>
       <w:pgSz w:w="12240" w:h="15840"/>
       <w:pgMar w:top="1440" w:right="1800" w:bottom="1440" w:left="1800" w:header="720" w:footer="720" w:gutter="0"/>
@@ -463,6 +817,10 @@
     <w:name w:val="Normal"/>
     <w:qFormat/>
     <w:rsid w:val="00FC693F"/>
+    <w:rPr>
+      <w:rFonts w:ascii="FangSong_GB2312" w:hAnsi="FangSong_GB2312"/>
+      <w:sz w:val="21"/>
+    </w:rPr>
   </w:style>
   <w:style w:type="paragraph" w:styleId="Header">
     <w:name w:val="header"/>

</xml_diff>